<commit_message>
Update Hensoldt LOI: current Enterprise commercials + CIO signatory
Per the Notion deal page (commercials updated 24 Jun 2026, superseding the
Domain-tier basis): Enterprise tier CHF 600,000 ARR over a 36-month term
(Y1 CHF 375,000 reflecting the 6-month intro at Domain price, then
CHF 600,000 p.a.), services CHF 67,500, total p.a. Y1 CHF 442,500.
Addressed to and signed by André Scheidhammer (CIO), HENSOLDT AG.
Ref LOI-2026-HE-001; Annex references offer NG-2026-HE-001 v1.0.

Co-Authored-By: Claude Opus 4.8 <noreply@anthropic.com>
Claude-Session: https://claude.ai/code/session_01W8kBBW4BVuRrNp2xJG4Ntk
</commit_message>
<xml_diff>
--- a/outputs/Novagentica_LOI_Hensoldt.docx
+++ b/outputs/Novagentica_LOI_Hensoldt.docx
@@ -37,9 +37,9 @@
                 <w:color w:val="0A1D3B"/>
                 <w:sz w:val="18"/>
               </w:rPr>
-              <w:t>Hensoldt AG</w:t>
+              <w:t>HENSOLDT AG</w:t>
               <w:br/>
-              <w:t>Attn.: Alex R — Project Lead</w:t>
+              <w:t>Attn.: André Scheidhammer — Chief Information Officer</w:t>
               <w:br/>
               <w:t>Willy-Messerschmitt-Strasse 3</w:t>
               <w:br/>
@@ -114,7 +114,7 @@
                 <w:color w:val="0A1D3B"/>
                 <w:sz w:val="17"/>
               </w:rPr>
-              <w:t>Ref.: LOI-2026-HENSOLDT-001</w:t>
+              <w:t>Ref.: LOI-2026-HE-001</w:t>
             </w:r>
           </w:p>
         </w:tc>
@@ -176,7 +176,7 @@
           <w:color w:val="1A1A1A"/>
           <w:sz w:val="19"/>
         </w:rPr>
-        <w:t>Dear Alex R,</w:t>
+        <w:t>Dear Mr Scheidhammer,</w:t>
       </w:r>
     </w:p>
     <w:p>
@@ -191,7 +191,7 @@
           <w:color w:val="1A1A1A"/>
           <w:sz w:val="19"/>
         </w:rPr>
-        <w:t>we appreciate your interest in the Novagentica Agentic AI Governance Platform and the trust you place in Novagentica. By way of this Letter of Intent (hereinafter the "LOI"), Novagentica AG (hereinafter "Novagentica") and Hensoldt AG (hereinafter the "Customer"; together the "Parties") record the current status of negotiations and their mutual intent to enter into detailed negotiations regarding a SaaS agreement.</w:t>
+        <w:t>we appreciate your interest in the Novagentica Agentic AI Governance Platform and the trust you place in Novagentica. By way of this Letter of Intent (hereinafter the "LOI"), Novagentica AG (hereinafter "Novagentica") and HENSOLDT AG (hereinafter the "Customer"; together the "Parties") record the current status of negotiations and their mutual intent to enter into detailed negotiations regarding a SaaS agreement.</w:t>
       </w:r>
     </w:p>
     <w:p>
@@ -371,7 +371,7 @@
                 <w:color w:val="1A1A1A"/>
                 <w:sz w:val="15"/>
               </w:rPr>
-              <w:t>Domain licence</w:t>
+              <w:t>Enterprise licence</w:t>
             </w:r>
           </w:p>
         </w:tc>
@@ -722,7 +722,7 @@
                 <w:color w:val="1A1A1A"/>
                 <w:sz w:val="15"/>
               </w:rPr>
-              <w:t>Novagentica Domain licence</w:t>
+              <w:t>Novagentica Enterprise licence</w:t>
             </w:r>
           </w:p>
         </w:tc>
@@ -744,7 +744,7 @@
                 <w:color w:val="1A1A1A"/>
                 <w:sz w:val="15"/>
               </w:rPr>
-              <w:t>CHF 150,000</w:t>
+              <w:t>CHF 375,000</w:t>
             </w:r>
           </w:p>
         </w:tc>
@@ -766,7 +766,7 @@
                 <w:color w:val="1A1A1A"/>
                 <w:sz w:val="15"/>
               </w:rPr>
-              <w:t>CHF 150,000</w:t>
+              <w:t>CHF 600,000</w:t>
             </w:r>
           </w:p>
         </w:tc>
@@ -788,7 +788,7 @@
                 <w:color w:val="1A1A1A"/>
                 <w:sz w:val="15"/>
               </w:rPr>
-              <w:t>Included scope: up to 20 agents, one business domain, 2 runtimes, 100,000 runs/month</w:t>
+              <w:t>Included scope: up to 100 agents, one business domain, all supported runtimes, 500,000 runs/month</w:t>
             </w:r>
           </w:p>
         </w:tc>
@@ -1006,7 +1006,7 @@
                 <w:color w:val="1A1A1A"/>
                 <w:sz w:val="15"/>
               </w:rPr>
-              <w:t>CHF 150,000</w:t>
+              <w:t>CHF 375,000</w:t>
             </w:r>
           </w:p>
         </w:tc>
@@ -1028,7 +1028,7 @@
                 <w:color w:val="1A1A1A"/>
                 <w:sz w:val="15"/>
               </w:rPr>
-              <w:t>CHF 150,000</w:t>
+              <w:t>CHF 600,000</w:t>
             </w:r>
           </w:p>
         </w:tc>
@@ -1073,7 +1073,7 @@
                 <w:color w:val="FFFFFF"/>
                 <w:sz w:val="15"/>
               </w:rPr>
-              <w:t>CHF 217,500</w:t>
+              <w:t>CHF 442,500</w:t>
             </w:r>
           </w:p>
         </w:tc>
@@ -1095,7 +1095,7 @@
                 <w:color w:val="FFFFFF"/>
                 <w:sz w:val="15"/>
               </w:rPr>
-              <w:t>CHF 150,000</w:t>
+              <w:t>CHF 600,000</w:t>
             </w:r>
           </w:p>
         </w:tc>
@@ -1126,7 +1126,7 @@
           <w:color w:val="1A1A1A"/>
           <w:sz w:val="16"/>
         </w:rPr>
-        <w:t>› Payment terms: annual licence fees payable in advance; implementation and professional services billed monthly in arrears.</w:t>
+        <w:t>› Payment terms: annual licence fees payable in advance; implementation and professional services billed against the agreed payment schedule; professional services payable 100% on the Effective Date.</w:t>
       </w:r>
     </w:p>
     <w:p>
@@ -1140,7 +1140,7 @@
           <w:color w:val="1A1A1A"/>
           <w:sz w:val="16"/>
         </w:rPr>
-        <w:t>› Usage: included agents, business domains, runtimes and run volumes are defined in Annex 1 or the Order Form; excess usage, custom runtimes or bespoke integrations require prior written agreement. As an introductory offer, Enterprise-tier platform features are made available at the Domain price for the first six (6) months from go-live, reverting to Domain tier thereafter unless the Parties agree otherwise.</w:t>
+        <w:t>› Usage: included agents, business domains, runtimes and run volumes are defined in Annex 1 or the Order Form; excess usage, custom runtimes or bespoke integrations require prior written agreement. Introductory period (first six (6) months, 01.07.2026–31.12.2026): Enterprise-tier capability is provided at the Domain price; the Customer may instead remain on the Domain tier by giving four (4) weeks’ written notice before 31.12.2026, failing which full Enterprise pricing applies from 01.01.2027. The licence auto-renews for fixed 12-month periods with a 12% annual uplift unless terminated on notice.</w:t>
       </w:r>
     </w:p>
     <w:p>
@@ -1168,7 +1168,7 @@
           <w:color w:val="1A1A1A"/>
           <w:sz w:val="16"/>
         </w:rPr>
-        <w:t>› Validity: this commercial basis is valid until 31 August 2026 unless superseded by execution of the main agreement.</w:t>
+        <w:t>› Validity: this commercial basis is valid until 30 September 2026 unless superseded by execution of the main agreement.</w:t>
       </w:r>
     </w:p>
     <w:p>
@@ -1425,7 +1425,7 @@
                 <w:color w:val="0A1D3B"/>
                 <w:sz w:val="17"/>
               </w:rPr>
-              <w:t>For Hensoldt AG</w:t>
+              <w:t>For HENSOLDT AG</w:t>
             </w:r>
           </w:p>
           <w:p>
@@ -1476,7 +1476,7 @@
                 <w:color w:val="1A1A1A"/>
                 <w:sz w:val="17"/>
               </w:rPr>
-              <w:t>Name / Title: ________________</w:t>
+              <w:t>Name / Title: André Scheidhammer, Chief Information Officer</w:t>
             </w:r>
           </w:p>
         </w:tc>
@@ -1494,7 +1494,7 @@
           <w:color w:val="1A1A1A"/>
           <w:sz w:val="16"/>
         </w:rPr>
-        <w:t>Annex 1: Novagentica–Hensoldt Engagement Offer v3.8 - Commercial Terms, Platform Scope, Usage Limits, Launch Package, Responsibilities and Timeline - forms an integral part of this LOI.</w:t>
+        <w:t>Annex 1: Novagentica–Hensoldt Engagement Offer NG-2026-HE-001 v1.0 - Commercial Terms, Platform Scope, Usage Limits, Launch Package, Responsibilities and Timeline - forms an integral part of this LOI.</w:t>
       </w:r>
     </w:p>
     <w:sectPr>

</xml_diff>

<commit_message>
Hensoldt LOI: use Notion payment schedule as commercial master
Replace the blended annual figures with the dated payment schedule from
the Notion deal page (master): 01.07.2026 CHF 150,000 + CHF 67,500
services (100% upfront); 01.01.2027 CHF 225,000; 01.07.2027 CHF 600,000;
01.07.2028 CHF 600,000; total contract value CHF 1,642,500. Novagentica
theme (navy/cyan) from the template preserved; signatory André
Scheidhammer (CIO), HENSOLDT AG.

Co-Authored-By: Claude Opus 4.8 <noreply@anthropic.com>
Claude-Session: https://claude.ai/code/session_01W8kBBW4BVuRrNp2xJG4Ntk
</commit_message>
<xml_diff>
--- a/outputs/Novagentica_LOI_Hensoldt.docx
+++ b/outputs/Novagentica_LOI_Hensoldt.docx
@@ -678,7 +678,7 @@
                 <w:color w:val="FFFFFF"/>
                 <w:sz w:val="15"/>
               </w:rPr>
-              <w:t>Y1 (Year 1)</w:t>
+              <w:t>Payment date</w:t>
             </w:r>
           </w:p>
         </w:tc>
@@ -699,7 +699,7 @@
                 <w:color w:val="FFFFFF"/>
                 <w:sz w:val="15"/>
               </w:rPr>
-              <w:t>Y2–Y3 (p.a.)</w:t>
+              <w:t>Amount (net, CHF)</w:t>
             </w:r>
           </w:p>
         </w:tc>
@@ -722,7 +722,7 @@
                 <w:color w:val="1A1A1A"/>
                 <w:sz w:val="15"/>
               </w:rPr>
-              <w:t>Novagentica Enterprise licence</w:t>
+              <w:t>Subscription — Novagentica Enterprise licence (first 6 months at Domain price)</w:t>
             </w:r>
           </w:p>
         </w:tc>
@@ -744,7 +744,7 @@
                 <w:color w:val="1A1A1A"/>
                 <w:sz w:val="15"/>
               </w:rPr>
-              <w:t>CHF 375,000</w:t>
+              <w:t>01.07.2026</w:t>
             </w:r>
           </w:p>
         </w:tc>
@@ -766,7 +766,7 @@
                 <w:color w:val="1A1A1A"/>
                 <w:sz w:val="15"/>
               </w:rPr>
-              <w:t>CHF 600,000</w:t>
+              <w:t>150,000</w:t>
             </w:r>
           </w:p>
         </w:tc>
@@ -788,7 +788,7 @@
                 <w:color w:val="1A1A1A"/>
                 <w:sz w:val="15"/>
               </w:rPr>
-              <w:t>Included scope: up to 100 agents, one business domain, all supported runtimes, 500,000 runs/month</w:t>
+              <w:t>Professional services — MVP delivery (100% upfront)</w:t>
             </w:r>
           </w:p>
         </w:tc>
@@ -809,7 +809,7 @@
                 <w:color w:val="1A1A1A"/>
                 <w:sz w:val="15"/>
               </w:rPr>
-              <w:t>Included</w:t>
+              <w:t>01.07.2026</w:t>
             </w:r>
           </w:p>
         </w:tc>
@@ -830,7 +830,7 @@
                 <w:color w:val="1A1A1A"/>
                 <w:sz w:val="15"/>
               </w:rPr>
-              <w:t>Included</w:t>
+              <w:t>67,500</w:t>
             </w:r>
           </w:p>
         </w:tc>
@@ -853,7 +853,7 @@
                 <w:color w:val="1A1A1A"/>
                 <w:sz w:val="15"/>
               </w:rPr>
-              <w:t>Launch Package / implementation services</w:t>
+              <w:t>Subscription — transition to full Enterprise pricing</w:t>
             </w:r>
           </w:p>
         </w:tc>
@@ -875,7 +875,7 @@
                 <w:color w:val="1A1A1A"/>
                 <w:sz w:val="15"/>
               </w:rPr>
-              <w:t>CHF 67,500</w:t>
+              <w:t>01.01.2027</w:t>
             </w:r>
           </w:p>
         </w:tc>
@@ -897,7 +897,7 @@
                 <w:color w:val="1A1A1A"/>
                 <w:sz w:val="15"/>
               </w:rPr>
-              <w:t>-</w:t>
+              <w:t>225,000</w:t>
             </w:r>
           </w:p>
         </w:tc>
@@ -919,7 +919,7 @@
                 <w:color w:val="1A1A1A"/>
                 <w:sz w:val="15"/>
               </w:rPr>
-              <w:t>Optional add-ons / additional services</w:t>
+              <w:t>Subscription — Enterprise tier (Year 2)</w:t>
             </w:r>
           </w:p>
         </w:tc>
@@ -940,7 +940,7 @@
                 <w:color w:val="1A1A1A"/>
                 <w:sz w:val="15"/>
               </w:rPr>
-              <w:t>By agreement (T&amp;M)</w:t>
+              <w:t>01.07.2027</w:t>
             </w:r>
           </w:p>
         </w:tc>
@@ -961,7 +961,7 @@
                 <w:color w:val="1A1A1A"/>
                 <w:sz w:val="15"/>
               </w:rPr>
-              <w:t>By agreement (T&amp;M)</w:t>
+              <w:t>600,000</w:t>
             </w:r>
           </w:p>
         </w:tc>
@@ -984,7 +984,7 @@
                 <w:color w:val="1A1A1A"/>
                 <w:sz w:val="15"/>
               </w:rPr>
-              <w:t>Annual licence costs</w:t>
+              <w:t>Subscription — Enterprise tier (Year 3)</w:t>
             </w:r>
           </w:p>
         </w:tc>
@@ -1006,7 +1006,7 @@
                 <w:color w:val="1A1A1A"/>
                 <w:sz w:val="15"/>
               </w:rPr>
-              <w:t>CHF 375,000</w:t>
+              <w:t>01.07.2028</w:t>
             </w:r>
           </w:p>
         </w:tc>
@@ -1028,7 +1028,7 @@
                 <w:color w:val="1A1A1A"/>
                 <w:sz w:val="15"/>
               </w:rPr>
-              <w:t>CHF 600,000</w:t>
+              <w:t>600,000</w:t>
             </w:r>
           </w:p>
         </w:tc>
@@ -1051,7 +1051,7 @@
                 <w:color w:val="FFFFFF"/>
                 <w:sz w:val="15"/>
               </w:rPr>
-              <w:t>Total cost p.a.</w:t>
+              <w:t>Total contract value (incl. services)</w:t>
             </w:r>
           </w:p>
         </w:tc>
@@ -1073,7 +1073,7 @@
                 <w:color w:val="FFFFFF"/>
                 <w:sz w:val="15"/>
               </w:rPr>
-              <w:t>CHF 442,500</w:t>
+              <w:t/>
             </w:r>
           </w:p>
         </w:tc>
@@ -1095,7 +1095,7 @@
                 <w:color w:val="FFFFFF"/>
                 <w:sz w:val="15"/>
               </w:rPr>
-              <w:t>CHF 600,000</w:t>
+              <w:t>1,642,500</w:t>
             </w:r>
           </w:p>
         </w:tc>
@@ -1112,7 +1112,7 @@
           <w:color w:val="1A1A1A"/>
           <w:sz w:val="16"/>
         </w:rPr>
-        <w:t>› Term: thirty-six (36) months from signature; fixed-price commitment for licence fees over the agreed term unless otherwise stated in the main agreement.</w:t>
+        <w:t>› Term: thirty-six (36) months from the Effective Date (01.07.2026 – 30.06.2029). Licence fees follow the payment schedule above. The licence auto-renews for fixed 12-month periods with a 12% annual uplift unless terminated on notice.</w:t>
       </w:r>
     </w:p>
     <w:p>
@@ -1126,7 +1126,7 @@
           <w:color w:val="1A1A1A"/>
           <w:sz w:val="16"/>
         </w:rPr>
-        <w:t>› Payment terms: annual licence fees payable in advance; implementation and professional services billed against the agreed payment schedule; professional services payable 100% on the Effective Date.</w:t>
+        <w:t>› Payment terms: subscription fees payable per the payment schedule above; professional services payable 100% on the Effective Date. Three-year subscription value CHF 1,575,000; total contract value including services CHF 1,642,500 (net of VAT and expenses).</w:t>
       </w:r>
     </w:p>
     <w:p>
@@ -1140,7 +1140,7 @@
           <w:color w:val="1A1A1A"/>
           <w:sz w:val="16"/>
         </w:rPr>
-        <w:t>› Usage: included agents, business domains, runtimes and run volumes are defined in Annex 1 or the Order Form; excess usage, custom runtimes or bespoke integrations require prior written agreement. Introductory period (first six (6) months, 01.07.2026–31.12.2026): Enterprise-tier capability is provided at the Domain price; the Customer may instead remain on the Domain tier by giving four (4) weeks’ written notice before 31.12.2026, failing which full Enterprise pricing applies from 01.01.2027. The licence auto-renews for fixed 12-month periods with a 12% annual uplift unless terminated on notice.</w:t>
+        <w:t>› Usage: included agents, business domains, runtimes and run volumes are defined in Annex 1 or the Order Form; excess usage, custom runtimes or bespoke integrations require prior written agreement. Introductory period (01.07.2026 – 31.12.2026): Enterprise-tier capability is provided at the Domain price; the Customer may instead remain on the Domain tier by giving four (4) weeks’ written notice before 31.12.2026, failing which full Enterprise pricing applies from 01.01.2027.</w:t>
       </w:r>
     </w:p>
     <w:p>

</xml_diff>